<commit_message>
Bot Arranque: lenguaje del examen suavizado (prueba sencilla que no se aprueba ni se pierde) — conserva ediciones de Diana
Co-Authored-By: Claude Fable 5 <noreply@anthropic.com>
Claude-Session: https://claude.ai/code/session_018H7C5dx3NvDfXiv3CfhPMa
</commit_message>
<xml_diff>
--- a/recursos/comercial/campañas/BOT_ARRANQUE_INFO_BRIAN.docx
+++ b/recursos/comercial/campañas/BOT_ARRANQUE_INFO_BRIAN.docx
@@ -72,7 +72,7 @@
           <w:b w:val="0"/>
           <w:i w:val="0"/>
         </w:rPr>
-        <w:t>Incluye: libros de ambos niveles + certificado oficial por cada nivel + examen internacional de entrada y salida + Garantía de Aprendizaje POR ESCRITO (anexa al contrato) + Módulo Emprendedor al terminar A2 (página web propia publicada, pitch en inglés, perfil para vender afuera, cuenta de pagos internacional, primer mensaje de venta enviado).</w:t>
+        <w:t>Incluye: libros de ambos niveles + certificado oficial por cada nivel + medición de tu avance al empezar y al terminar (una prueba sencilla que no se aprueba ni se pierde — respalda la garantía) + Garantía de Aprendizaje POR ESCRITO (anexa al contrato) + Módulo Emprendedor al terminar A2 (página web propia publicada, pitch en inglés, perfil para vender afuera, cuenta de pagos internacional, primer mensaje de venta enviado).</w:t>
       </w:r>
     </w:p>
     <w:p>
@@ -160,7 +160,7 @@
         <w:spacing w:after="160"/>
       </w:pPr>
       <w:r>
-        <w:t>BOT: Todo esto: los 2 primeros niveles completos (200 horas presenciales), libros, certificado oficial por cada nivel, examen internacional de entrada y salida, garantía de aprendizaje por escrito, y al terminar sales con tu propia página web publicada y tu primer mensaje de venta en inglés. ¿Te agendo una cita para contarte cómo funciona? Tengo [día/hora] o [día/hora].</w:t>
+        <w:t>BOT: Todo esto: los 2 primeros niveles completos (200 horas presenciales), libros, certificado oficial por cada nivel, garantía de aprendizaje por escrito, y al terminar sales con tu propia página web publicada y tu primer mensaje de venta en inglés. ¿Te agendo una cita para contarte cómo funciona? Tengo [día/hora] o [día/hora].</w:t>
       </w:r>
     </w:p>
     <w:p>
@@ -217,7 +217,7 @@
         <w:spacing w:after="160"/>
       </w:pPr>
       <w:r>
-        <w:t>BOT: Es única en la ciudad y va POR ESCRITO en tu contrato: presentas un examen internacional al entrar y otro al salir; si cumples con asistencia, tareas y evaluaciones, y tu examen de salida no supera al de entrada, te devolvemos el 100% del nivel. ¿Te agendo para mostrártela completa?</w:t>
+        <w:t>BOT: Es única en la ciudad y va POR ESCRITO en tu contrato: al empezar presentas una prueba sencilla — no se aprueba ni se pierde, es solo tu punto de partida — y al terminar otra. Si cumples con asistencia, tareas y evaluaciones, y tu prueba final no muestra avance sobre la inicial, te devolvemos el 100% del nivel. ¿Te agendo para mostrártela completa?</w:t>
       </w:r>
     </w:p>
     <w:p>
@@ -236,7 +236,7 @@
         <w:spacing w:after="160"/>
       </w:pPr>
       <w:r>
-        <w:t>BOT: Nuestros profesores son certificados y expertos en hispanohablantes: en los primeros niveles necesitas un profe que entienda exactamente tus errores — y tu avance no depende de la nacionalidad de nadie: se mide con examen internacional y está garantizado por escrito. ¿Te agendo una cita?</w:t>
+        <w:t>BOT: Nuestros profesores son certificados y expertos en hispanohablantes: en los primeros niveles necesitas un profe que entienda exactamente tus errores — y tu avance no depende de la nacionalidad de nadie: queda medido desde el día uno y garantizado por escrito. ¿Te agendo una cita?</w:t>
       </w:r>
     </w:p>
     <w:p>

</xml_diff>

<commit_message>
Bot Arranque p/ Brian: regla 7 QUITAR Cajasan del flujo (programa propio de ingles) con respuesta de rescate, formas de pago definidas (contado o inicial desde \$598k + hasta 4 cuotas), citas con la asesora comercial (rol), corchete de pagos resuelto
Co-Authored-By: Claude Fable 5 <noreply@anthropic.com>
Claude-Session: https://claude.ai/code/session_018H7C5dx3NvDfXiv3CfhPMa
</commit_message>
<xml_diff>
--- a/recursos/comercial/campañas/BOT_ARRANQUE_INFO_BRIAN.docx
+++ b/recursos/comercial/campañas/BOT_ARRANQUE_INFO_BRIAN.docx
@@ -109,7 +109,7 @@
           <w:i w:val="0"/>
           <w:color w:val="666666"/>
         </w:rPr>
-        <w:t>[DIANA CONFIRMA antes de cargar]: fecha de inicio de la cohorte · jornadas/horarios disponibles · edad mínima · formas de pago del Arranque (¿contado / cuotas y cómo?).</w:t>
+        <w:t>[DIANA CONFIRMA antes de cargar]: fecha de inicio de la cohorte · jornadas/horarios disponibles · edad mínima. (Formas de pago: YA definidas — ver respuesta de cuotas.)</w:t>
       </w:r>
     </w:p>
     <w:p>
@@ -179,7 +179,7 @@
         <w:spacing w:after="160"/>
       </w:pPr>
       <w:r>
-        <w:t>BOT: [SEGÚN CONFIRMACIÓN DE DIANA]. Las opciones de pago exactas te las mostramos en la cita según tu caso. ¿Te sirve [día/hora] o [día/hora]?</w:t>
+        <w:t>BOT: Puedes pagar de contado (transferencia, efectivo o tarjeta) o a cuotas: separas tu cupo desde $100.000, das una cuota inicial desde $598.000 y el resto hasta en 4 cuotas mensuales según la jornada. El plan exacto te lo arma la asesora en la cita con tus números reales. ¿Te sirve [día/hora] o [día/hora]?</w:t>
       </w:r>
     </w:p>
     <w:p>
@@ -373,7 +373,7 @@
           <w:b w:val="0"/>
           <w:i w:val="0"/>
         </w:rPr>
-        <w:t>4. Las citas se agendan con Carelis (la asesora). Confirmación el día antes y el día de la cita.</w:t>
+        <w:t>4. Las citas se agendan con la asesora comercial. Confirmación el día antes y el día de la cita.</w:t>
       </w:r>
     </w:p>
     <w:p>
@@ -398,6 +398,11 @@
           <w:i w:val="0"/>
         </w:rPr>
         <w:t>6. Nada de promos anteriores en las respuestas (limpiar cualquier texto viejo del flujo).</w:t>
+      </w:r>
+    </w:p>
+    <w:p>
+      <w:r>
+        <w:t>7. CAJASAN — QUITAR del flujo actual toda mención de crédito o libranza Cajasan: Cajasan sacó su propio programa de inglés y no le hacemos publicidad. Si el lead pregunta por Cajasan: "Nuestro convenio Cajasan te da un beneficio directo en tu plan de pagos — la asesora te lo aplica en la cita con tu carné de afiliado. ¿Te agendo?"</w:t>
       </w:r>
     </w:p>
     <w:p>

</xml_diff>

<commit_message>
MODULO PASAPORTE nuevo: modulo de graduacion a eleccion (Emprendedor o Pasaporte) al terminar A2 — anexo p/ asesoras (bifurcacion de suenos, 5 entregables, jamases visa/empleo) + bot actualizado (ficha, Q&A emprendimiento, Q&A Au Pair nueva)
Co-Authored-By: Claude Fable 5 <noreply@anthropic.com>
Claude-Session: https://claude.ai/code/session_018H7C5dx3NvDfXiv3CfhPMa
</commit_message>
<xml_diff>
--- a/recursos/comercial/campañas/BOT_ARRANQUE_INFO_BRIAN.docx
+++ b/recursos/comercial/campañas/BOT_ARRANQUE_INFO_BRIAN.docx
@@ -72,7 +72,7 @@
           <w:b w:val="0"/>
           <w:i w:val="0"/>
         </w:rPr>
-        <w:t>Incluye: libros de ambos niveles + certificado oficial por cada nivel + medición de tu avance al empezar y al terminar (una prueba sencilla que no se aprueba ni se pierde — respalda la garantía) + Garantía de Aprendizaje POR ESCRITO (anexa al contrato) + Módulo Emprendedor al terminar A2 (página web propia publicada, pitch en inglés, perfil para vender afuera, cuenta de pagos internacional, primer mensaje de venta enviado).</w:t>
+        <w:t>Incluye: libros de ambos niveles + certificado oficial por cada nivel + medición de tu avance al empezar y al terminar (una prueba sencilla que no se aprueba ni se pierde — respalda la garantía) + Garantía de Aprendizaje POR ESCRITO (anexa al contrato) + Módulo de graduación al terminar A2, A ELECCIÓN: EMPRENDEDOR (página web propia publicada, pitch en inglés, perfil para vender afuera, cuenta de pagos internacional, primer mensaje de venta) o PASAPORTE (video de presentación, aplicación en inglés para Au Pair/Work &amp; Travel, entrevista simulada, certificado internacional).</w:t>
       </w:r>
     </w:p>
     <w:p>
@@ -293,7 +293,20 @@
         <w:spacing w:after="160"/>
       </w:pPr>
       <w:r>
-        <w:t>BOT: Sí: al terminar tu A2 haces el Módulo Emprendedor — sales con tu página web publicada con dominio propio, tu pitch en inglés y tu primer mensaje de venta enviado a un cliente extranjero real. Nadie más en Bucaramanga entrega eso. ¿Agendamos?</w:t>
+        <w:t>BOT: Sí: al terminar tu A2 eliges tu módulo de graduación — EMPRENDEDOR (tu página web publicada con dominio propio, tu pitch en inglés y tu primer mensaje de venta a un cliente real) o PASAPORTE (tu video y tu aplicación en inglés para irte de Au Pair o Work &amp; Travel, con entrevista ensayada). Nadie más en Bucaramanga entrega eso. ¿Agendamos?</w:t>
+      </w:r>
+    </w:p>
+    <w:p>
+      <w:r>
+        <w:rPr>
+          <w:b/>
+        </w:rPr>
+        <w:t>LEAD: Me quiero ir de Au Pair / niñera / Work and Travel — ¿me sirve?</w:t>
+      </w:r>
+    </w:p>
+    <w:p>
+      <w:r>
+        <w:t>BOT: ¡Es exactamente para ti! El inglés conversacional es el requisito #1 para irte — y al terminar tu A2 haces el Módulo Pasaporte: tu video de presentación, tu aplicación en inglés y tu entrevista ensayada, con certificado internacional. Además trabajamos solo con operadores verificados. ¿Te agendo una cita? Tengo [día/hora] o [día/hora].</w:t>
       </w:r>
     </w:p>
     <w:p>

</xml_diff>